<commit_message>
design: add X9 trust ramp for new sellers to the plan
Our answer to payOrRefuse: an unknown seller gets a small trial limit
that rises with good deliveries and drops to zero after a bad one, for
every agent at once. Outcomes ride on the receipt memos, so track
records can be rebuilt from Solana by anyone. Added to the standout
features table, a detail box, and the demo script.

Co-Authored-By: Claude Opus 5.5 <noreply@anthropic.com>
</commit_message>
<xml_diff>
--- a/Analysis/what-won-and-how-we-win.docx
+++ b/Analysis/what-won-and-how-we-win.docx
@@ -147,7 +147,7 @@
                 <w:sz w:val="20"/>
                 <w:szCs w:val="20"/>
               </w:rPr>
-              <w:t xml:space="preserve"> a solid baseline of eight features (B1–B8) that every winner had some version of, built on Solana so the token program itself enforces the limit, plus a few standout features (X1–X8) that nobody at ETHOnline could show, led by </w:t>
+              <w:t xml:space="preserve"> a solid baseline of eight features (B1–B8) that every winner had some version of, built on Solana so the token program itself enforces the limit, plus a few standout features (X1–X9) that nobody at ETHOnline could show, led by </w:t>
             </w:r>
             <w:r>
               <w:rPr>
@@ -10537,7 +10537,7 @@
         <w:rPr>
           <w:rFonts w:ascii="Calibri" w:cs="Calibri" w:eastAsia="Calibri" w:hAnsi="Calibri"/>
         </w:rPr>
-        <w:t xml:space="preserve">The standout features: what makes us unique (X1–X8)</w:t>
+        <w:t xml:space="preserve">The standout features: what makes us unique (X1–X9)</w:t>
       </w:r>
     </w:p>
     <w:p>
@@ -10562,7 +10562,35 @@
         <w:rPr>
           <w:rFonts w:ascii="Calibri" w:cs="Calibri" w:eastAsia="Calibri" w:hAnsi="Calibri"/>
         </w:rPr>
-        <w:t xml:space="preserve"> and should all make it. X2 and X8 if time allows. </w:t>
+        <w:t xml:space="preserve"> and should all make it. X2, X8 and </w:t>
+      </w:r>
+      <w:r>
+        <w:rPr>
+          <w:rFonts w:ascii="Calibri" w:cs="Calibri" w:eastAsia="Calibri" w:hAnsi="Calibri"/>
+          <w:b/>
+          <w:bCs/>
+        </w:rPr>
+        <w:t xml:space="preserve">X9</w:t>
+      </w:r>
+      <w:r>
+        <w:rPr>
+          <w:rFonts w:ascii="Calibri" w:cs="Calibri" w:eastAsia="Calibri" w:hAnsi="Calibri"/>
+        </w:rPr>
+        <w:t xml:space="preserve"> if time allows; </w:t>
+      </w:r>
+      <w:r>
+        <w:rPr>
+          <w:rFonts w:ascii="Calibri" w:cs="Calibri" w:eastAsia="Calibri" w:hAnsi="Calibri"/>
+          <w:b/>
+          <w:bCs/>
+        </w:rPr>
+        <w:t xml:space="preserve">X9 can replace X8</w:t>
+      </w:r>
+      <w:r>
+        <w:rPr>
+          <w:rFonts w:ascii="Calibri" w:cs="Calibri" w:eastAsia="Calibri" w:hAnsi="Calibri"/>
+        </w:rPr>
+        <w:t xml:space="preserve"> if time is tight. </w:t>
       </w:r>
       <w:r>
         <w:rPr>
@@ -12023,6 +12051,163 @@
           </w:p>
         </w:tc>
       </w:tr>
+      <w:tr>
+        <w:tc>
+          <w:tcPr>
+            <w:tcW w:type="dxa" w:w="500"/>
+            <w:tcBorders>
+              <w:top w:val="single" w:color="D9DEDB" w:sz="4"/>
+              <w:left w:val="single" w:color="D9DEDB" w:sz="4"/>
+              <w:bottom w:val="single" w:color="D9DEDB" w:sz="4"/>
+              <w:right w:val="single" w:color="D9DEDB" w:sz="4"/>
+            </w:tcBorders>
+            <w:shd w:fill="FFFFFF" w:color="auto" w:val="clear"/>
+            <w:tcMar>
+              <w:top w:type="dxa" w:w="70"/>
+              <w:left w:type="dxa" w:w="110"/>
+              <w:bottom w:type="dxa" w:w="70"/>
+              <w:right w:type="dxa" w:w="110"/>
+            </w:tcMar>
+          </w:tcPr>
+          <w:p>
+            <w:pPr>
+              <w:spacing w:after="40" w:line="264"/>
+            </w:pPr>
+            <w:r>
+              <w:rPr>
+                <w:rFonts w:ascii="Calibri" w:cs="Calibri" w:eastAsia="Calibri" w:hAnsi="Calibri"/>
+                <w:sz w:val="19"/>
+                <w:szCs w:val="19"/>
+              </w:rPr>
+              <w:t xml:space="preserve">X9</w:t>
+            </w:r>
+          </w:p>
+        </w:tc>
+        <w:tc>
+          <w:tcPr>
+            <w:tcW w:type="dxa" w:w="1900"/>
+            <w:tcBorders>
+              <w:top w:val="single" w:color="D9DEDB" w:sz="4"/>
+              <w:left w:val="single" w:color="D9DEDB" w:sz="4"/>
+              <w:bottom w:val="single" w:color="D9DEDB" w:sz="4"/>
+              <w:right w:val="single" w:color="D9DEDB" w:sz="4"/>
+            </w:tcBorders>
+            <w:shd w:fill="FFFFFF" w:color="auto" w:val="clear"/>
+            <w:tcMar>
+              <w:top w:type="dxa" w:w="70"/>
+              <w:left w:type="dxa" w:w="110"/>
+              <w:bottom w:type="dxa" w:w="70"/>
+              <w:right w:type="dxa" w:w="110"/>
+            </w:tcMar>
+          </w:tcPr>
+          <w:p>
+            <w:pPr>
+              <w:spacing w:after="40" w:line="264"/>
+            </w:pPr>
+            <w:r>
+              <w:rPr>
+                <w:rFonts w:ascii="Calibri" w:cs="Calibri" w:eastAsia="Calibri" w:hAnsi="Calibri"/>
+                <w:sz w:val="19"/>
+                <w:szCs w:val="19"/>
+              </w:rPr>
+              <w:t xml:space="preserve">Trust ramp for new sellers</w:t>
+            </w:r>
+          </w:p>
+        </w:tc>
+        <w:tc>
+          <w:tcPr>
+            <w:tcW w:type="dxa" w:w="4538"/>
+            <w:tcBorders>
+              <w:top w:val="single" w:color="D9DEDB" w:sz="4"/>
+              <w:left w:val="single" w:color="D9DEDB" w:sz="4"/>
+              <w:bottom w:val="single" w:color="D9DEDB" w:sz="4"/>
+              <w:right w:val="single" w:color="D9DEDB" w:sz="4"/>
+            </w:tcBorders>
+            <w:shd w:fill="FFFFFF" w:color="auto" w:val="clear"/>
+            <w:tcMar>
+              <w:top w:type="dxa" w:w="70"/>
+              <w:left w:type="dxa" w:w="110"/>
+              <w:bottom w:type="dxa" w:w="70"/>
+              <w:right w:type="dxa" w:w="110"/>
+            </w:tcMar>
+          </w:tcPr>
+          <w:p>
+            <w:pPr>
+              <w:spacing w:after="40" w:line="264"/>
+            </w:pPr>
+            <w:r>
+              <w:rPr>
+                <w:rFonts w:ascii="Calibri" w:cs="Calibri" w:eastAsia="Calibri" w:hAnsi="Calibri"/>
+                <w:sz w:val="19"/>
+                <w:szCs w:val="19"/>
+              </w:rPr>
+              <w:t xml:space="preserve">An unknown seller is not refused outright: it gets a trial limit (e.g. €0.10 in total) that rises with each good delivery and drops to €0 after a bad one, for every agent at once. Delivery outcomes are recorded with each payment receipt, so any seller's track record can be rebuilt by anyone from the Solana chain. Counts distinct payers and good deliveries, so a seller cannot fake reputation by paying itself.</w:t>
+            </w:r>
+          </w:p>
+        </w:tc>
+        <w:tc>
+          <w:tcPr>
+            <w:tcW w:type="dxa" w:w="1300"/>
+            <w:tcBorders>
+              <w:top w:val="single" w:color="D9DEDB" w:sz="4"/>
+              <w:left w:val="single" w:color="D9DEDB" w:sz="4"/>
+              <w:bottom w:val="single" w:color="D9DEDB" w:sz="4"/>
+              <w:right w:val="single" w:color="D9DEDB" w:sz="4"/>
+            </w:tcBorders>
+            <w:shd w:fill="FFFFFF" w:color="auto" w:val="clear"/>
+            <w:tcMar>
+              <w:top w:type="dxa" w:w="70"/>
+              <w:left w:type="dxa" w:w="110"/>
+              <w:bottom w:type="dxa" w:w="70"/>
+              <w:right w:type="dxa" w:w="110"/>
+            </w:tcMar>
+          </w:tcPr>
+          <w:p>
+            <w:pPr>
+              <w:spacing w:after="40" w:line="264"/>
+            </w:pPr>
+            <w:r>
+              <w:rPr>
+                <w:rFonts w:ascii="Calibri" w:cs="Calibri" w:eastAsia="Calibri" w:hAnsi="Calibri"/>
+                <w:sz w:val="19"/>
+                <w:szCs w:val="19"/>
+              </w:rPr>
+              <w:t xml:space="preserve">Small–Medium</w:t>
+            </w:r>
+          </w:p>
+        </w:tc>
+        <w:tc>
+          <w:tcPr>
+            <w:tcW w:type="dxa" w:w="1400"/>
+            <w:tcBorders>
+              <w:top w:val="single" w:color="D9DEDB" w:sz="4"/>
+              <w:left w:val="single" w:color="D9DEDB" w:sz="4"/>
+              <w:bottom w:val="single" w:color="D9DEDB" w:sz="4"/>
+              <w:right w:val="single" w:color="D9DEDB" w:sz="4"/>
+            </w:tcBorders>
+            <w:shd w:fill="FFFFFF" w:color="auto" w:val="clear"/>
+            <w:tcMar>
+              <w:top w:type="dxa" w:w="70"/>
+              <w:left w:type="dxa" w:w="110"/>
+              <w:bottom w:type="dxa" w:w="70"/>
+              <w:right w:type="dxa" w:w="110"/>
+            </w:tcMar>
+          </w:tcPr>
+          <w:p>
+            <w:pPr>
+              <w:spacing w:after="40" w:line="264"/>
+            </w:pPr>
+            <w:r>
+              <w:rPr>
+                <w:rFonts w:ascii="Calibri" w:cs="Calibri" w:eastAsia="Calibri" w:hAnsi="Calibri"/>
+                <w:sz w:val="19"/>
+                <w:szCs w:val="19"/>
+              </w:rPr>
+              <w:t xml:space="preserve">payOrRefuse</w:t>
+            </w:r>
+          </w:p>
+        </w:tc>
+      </w:tr>
     </w:tbl>
     <w:p>
       <w:pPr>
@@ -12111,6 +12296,176 @@
       </w:tr>
     </w:tbl>
     <w:p>
+      <w:r>
+        <w:br w:type="page"/>
+      </w:r>
+    </w:p>
+    <w:tbl>
+      <w:tblPr>
+        <w:tblW w:type="dxa" w:w="9638"/>
+        <w:tblBorders>
+          <w:top w:val="single" w:color="auto" w:sz="4"/>
+          <w:left w:val="single" w:color="auto" w:sz="4"/>
+          <w:bottom w:val="single" w:color="auto" w:sz="4"/>
+          <w:right w:val="single" w:color="auto" w:sz="4"/>
+          <w:insideH w:val="single" w:color="auto" w:sz="4"/>
+          <w:insideV w:val="single" w:color="auto" w:sz="4"/>
+        </w:tblBorders>
+      </w:tblPr>
+      <w:tblGrid>
+        <w:gridCol w:w="9638"/>
+      </w:tblGrid>
+      <w:tr>
+        <w:tc>
+          <w:tcPr>
+            <w:tcW w:type="dxa" w:w="9638"/>
+            <w:tcBorders>
+              <w:top w:val="none" w:color="FFFFFF" w:sz="0"/>
+              <w:left w:val="single" w:color="0D6B63" w:sz="24"/>
+              <w:bottom w:val="none" w:color="FFFFFF" w:sz="0"/>
+              <w:right w:val="none" w:color="FFFFFF" w:sz="0"/>
+            </w:tcBorders>
+            <w:shd w:fill="E1F0ED" w:color="auto" w:val="clear"/>
+            <w:tcMar>
+              <w:top w:type="dxa" w:w="120"/>
+              <w:left w:type="dxa" w:w="200"/>
+              <w:bottom w:type="dxa" w:w="120"/>
+              <w:right w:type="dxa" w:w="200"/>
+            </w:tcMar>
+          </w:tcPr>
+          <w:p>
+            <w:pPr>
+              <w:spacing w:after="80"/>
+            </w:pPr>
+            <w:r>
+              <w:rPr>
+                <w:rFonts w:ascii="Calibri" w:cs="Calibri" w:eastAsia="Calibri" w:hAnsi="Calibri"/>
+                <w:b/>
+                <w:bCs/>
+                <w:color w:val="0D6B63"/>
+              </w:rPr>
+              <w:t xml:space="preserve">X9 · Trust ramp, our answer to payOrRefuse</w:t>
+            </w:r>
+          </w:p>
+          <w:p>
+            <w:pPr>
+              <w:spacing w:after="60" w:line="276"/>
+            </w:pPr>
+            <w:r>
+              <w:rPr>
+                <w:rFonts w:ascii="Calibri" w:cs="Calibri" w:eastAsia="Calibri" w:hAnsi="Calibri"/>
+                <w:sz w:val="20"/>
+                <w:szCs w:val="20"/>
+              </w:rPr>
+              <w:t xml:space="preserve">payOrRefuse gives a seller a yes or no from outside evidence. </w:t>
+            </w:r>
+            <w:r>
+              <w:rPr>
+                <w:rFonts w:ascii="Calibri" w:cs="Calibri" w:eastAsia="Calibri" w:hAnsi="Calibri"/>
+                <w:b/>
+                <w:bCs/>
+                <w:sz w:val="20"/>
+                <w:szCs w:val="20"/>
+              </w:rPr>
+              <w:t xml:space="preserve">We give a new seller ten cents of trust and let it earn the rest.</w:t>
+            </w:r>
+          </w:p>
+          <w:p>
+            <w:pPr>
+              <w:spacing w:after="60" w:line="276"/>
+            </w:pPr>
+            <w:r>
+              <w:rPr>
+                <w:rFonts w:ascii="Calibri" w:cs="Calibri" w:eastAsia="Calibri" w:hAnsi="Calibri"/>
+                <w:b/>
+                <w:bCs/>
+                <w:sz w:val="20"/>
+                <w:szCs w:val="20"/>
+              </w:rPr>
+              <w:t xml:space="preserve">How it works:</w:t>
+            </w:r>
+            <w:r>
+              <w:rPr>
+                <w:rFonts w:ascii="Calibri" w:cs="Calibri" w:eastAsia="Calibri" w:hAnsi="Calibri"/>
+                <w:sz w:val="20"/>
+                <w:szCs w:val="20"/>
+              </w:rPr>
+              <w:t xml:space="preserve"> new seller → trial limit €0.10 (reason code SELLER_ON_TRIAL / TRIAL_LIMIT_REACHED) → each good delivery steps the limit up (€0.10 → €1 → €5 → normal) → a bad delivery drops it to €0 for every agent (SELLER_DOWNGRADED).</w:t>
+            </w:r>
+          </w:p>
+          <w:p>
+            <w:pPr>
+              <w:spacing w:after="60" w:line="276"/>
+            </w:pPr>
+            <w:r>
+              <w:rPr>
+                <w:rFonts w:ascii="Calibri" w:cs="Calibri" w:eastAsia="Calibri" w:hAnsi="Calibri"/>
+                <w:b/>
+                <w:bCs/>
+                <w:sz w:val="20"/>
+                <w:szCs w:val="20"/>
+              </w:rPr>
+              <w:t xml:space="preserve">Why it is ours:</w:t>
+            </w:r>
+            <w:r>
+              <w:rPr>
+                <w:rFonts w:ascii="Calibri" w:cs="Calibri" w:eastAsia="Calibri" w:hAnsi="Calibri"/>
+                <w:sz w:val="20"/>
+                <w:szCs w:val="20"/>
+              </w:rPr>
+              <w:t xml:space="preserve"> outcomes ride on the B6 receipt memos, so track records are rebuilt from Solana by anyone, and every customer protects every other customer, which is our growth story.</w:t>
+            </w:r>
+          </w:p>
+          <w:p>
+            <w:pPr>
+              <w:spacing w:after="60" w:line="276"/>
+            </w:pPr>
+            <w:r>
+              <w:rPr>
+                <w:rFonts w:ascii="Calibri" w:cs="Calibri" w:eastAsia="Calibri" w:hAnsi="Calibri"/>
+                <w:b/>
+                <w:bCs/>
+                <w:sz w:val="20"/>
+                <w:szCs w:val="20"/>
+              </w:rPr>
+              <w:t xml:space="preserve">Who enforces what:</w:t>
+            </w:r>
+            <w:r>
+              <w:rPr>
+                <w:rFonts w:ascii="Calibri" w:cs="Calibri" w:eastAsia="Calibri" w:hAnsi="Calibri"/>
+                <w:sz w:val="20"/>
+                <w:szCs w:val="20"/>
+              </w:rPr>
+              <w:t xml:space="preserve"> the agent's overall cap is enforced by the token program; per-seller trial limits by our gate, or on chain through Squads spending limits with a recipient list if Squads works on devnet.</w:t>
+            </w:r>
+          </w:p>
+          <w:p>
+            <w:pPr>
+              <w:spacing w:after="60" w:line="276"/>
+            </w:pPr>
+            <w:r>
+              <w:rPr>
+                <w:rFonts w:ascii="Calibri" w:cs="Calibri" w:eastAsia="Calibri" w:hAnsi="Calibri"/>
+                <w:b/>
+                <w:bCs/>
+                <w:sz w:val="20"/>
+                <w:szCs w:val="20"/>
+              </w:rPr>
+              <w:t xml:space="preserve">Pitch line:</w:t>
+            </w:r>
+            <w:r>
+              <w:rPr>
+                <w:rFonts w:ascii="Calibri" w:cs="Calibri" w:eastAsia="Calibri" w:hAnsi="Calibri"/>
+                <w:sz w:val="20"/>
+                <w:szCs w:val="20"/>
+              </w:rPr>
+              <w:t xml:space="preserve"> “A company card trusts a merchant fully or not at all. Our agents give a new seller ten cents of trust and let it earn the rest.”</w:t>
+            </w:r>
+          </w:p>
+        </w:tc>
+      </w:tr>
+    </w:tbl>
+    <w:p>
       <w:pPr>
         <w:pStyle w:val="Heading2"/>
       </w:pPr>
@@ -12118,7 +12473,7 @@
         <w:rPr>
           <w:rFonts w:ascii="Calibri" w:cs="Calibri" w:eastAsia="Calibri" w:hAnsi="Calibri"/>
         </w:rPr>
-        <w:t xml:space="preserve">The demo (about 2 minutes)</w:t>
+        <w:t xml:space="preserve">The demo (about 2½ minutes)</w:t>
       </w:r>
     </w:p>
     <w:p>
@@ -12253,6 +12608,30 @@
           <w:rFonts w:ascii="Calibri" w:cs="Calibri" w:eastAsia="Calibri" w:hAnsi="Calibri"/>
         </w:rPr>
         <w:t xml:space="preserve">: the agent signs directly, and Solana refuses (X1). Blast-radius meter shows the most it could ever take (X3).</w:t>
+      </w:r>
+    </w:p>
+    <w:p>
+      <w:pPr>
+        <w:pStyle w:val="ListParagraph"/>
+        <w:numPr>
+          <w:ilvl w:val="0"/>
+          <w:numId w:val="19"/>
+        </w:numPr>
+        <w:spacing w:after="60" w:line="276"/>
+      </w:pPr>
+      <w:r>
+        <w:rPr>
+          <w:rFonts w:ascii="Calibri" w:cs="Calibri" w:eastAsia="Calibri" w:hAnsi="Calibri"/>
+          <w:b/>
+          <w:bCs/>
+        </w:rPr>
+        <w:t xml:space="preserve">New seller (20 s, X9):</w:t>
+      </w:r>
+      <w:r>
+        <w:rPr>
+          <w:rFonts w:ascii="Calibri" w:cs="Calibri" w:eastAsia="Calibri" w:hAnsi="Calibri"/>
+        </w:rPr>
+        <w:t xml:space="preserve"> agent buys a €0.10 sample from an unknown seller; good delivery raises its limit to €1; the seller then returns junk, the agent flags it and the seller drops to €0 for every agent.</w:t>
       </w:r>
     </w:p>
     <w:p>

</xml_diff>